<commit_message>
Correcciones en los archivos
</commit_message>
<xml_diff>
--- a/Guia_Git_GitHub.docx
+++ b/Guia_Git_GitHub.docx
@@ -2,7 +2,7 @@
 <file path=word/document.xml><?xml version="1.0" encoding="utf-8"?>
 <w:document xmlns:w="http://schemas.openxmlformats.org/wordprocessingml/2006/main" xmlns:m="http://schemas.openxmlformats.org/officeDocument/2006/math" xmlns:r="http://schemas.openxmlformats.org/officeDocument/2006/relationships" xmlns:o="urn:schemas-microsoft-com:office:office" xmlns:v="urn:schemas-microsoft-com:vml" xmlns:w10="urn:schemas-microsoft-com:office:word" xmlns:a="http://schemas.openxmlformats.org/drawingml/2006/main" xmlns:pic="http://schemas.openxmlformats.org/drawingml/2006/picture" xmlns:wp="http://schemas.openxmlformats.org/drawingml/2006/wordprocessingDrawing">
   <w:body>
-    <w:bookmarkStart w:id="57" w:name="git-y-github-explicado-desde-cero"/>
+    <w:bookmarkStart w:id="61" w:name="git-y-github-explicado-desde-cero"/>
     <w:p>
       <w:pPr>
         <w:pStyle w:val="Heading1"/>
@@ -349,7 +349,7 @@
       </w:r>
     </w:p>
     <w:bookmarkEnd w:id="9"/>
-    <w:bookmarkStart w:id="18" w:name="instalación-cómo-empezar-a-trabajar"/>
+    <w:bookmarkStart w:id="19" w:name="instalación-cómo-empezar-a-trabajar"/>
     <w:p>
       <w:pPr>
         <w:pStyle w:val="Heading2"/>
@@ -1529,6 +1529,791 @@
         <w:t xml:space="preserve">.</w:t>
       </w:r>
     </w:p>
+    <w:bookmarkEnd w:id="17"/>
+    <w:bookmarkStart w:id="18" w:name="X6036592f6c3a7b5deb7a73c180f540533fedc87"/>
+    <w:p>
+      <w:pPr>
+        <w:pStyle w:val="Heading3"/>
+      </w:pPr>
+      <w:r>
+        <w:t xml:space="preserve">2.7</w:t>
+      </w:r>
+      <w:r>
+        <w:t xml:space="preserve"> </w:t>
+      </w:r>
+      <w:r>
+        <w:t xml:space="preserve">“Me marca error en</w:t>
+      </w:r>
+      <w:r>
+        <w:t xml:space="preserve"> </w:t>
+      </w:r>
+      <w:r>
+        <w:rPr>
+          <w:rStyle w:val="VerbatimChar"/>
+        </w:rPr>
+        <w:t xml:space="preserve">git push -u origin main</w:t>
+      </w:r>
+      <w:r>
+        <w:t xml:space="preserve">”</w:t>
+      </w:r>
+      <w:r>
+        <w:t xml:space="preserve"> </w:t>
+      </w:r>
+      <w:r>
+        <w:t xml:space="preserve">— diagnóstico a prueba de errores</w:t>
+      </w:r>
+    </w:p>
+    <w:p>
+      <w:pPr>
+        <w:pStyle w:val="FirstParagraph"/>
+      </w:pPr>
+      <w:r>
+        <w:t xml:space="preserve">Este es el tropiezo más común de quien conecta Git con GitHub por primera vez. Antes que nada, corre estos tres comandos — con lo que devuelvan casi siempre se identifica la causa:</w:t>
+      </w:r>
+    </w:p>
+    <w:p>
+      <w:pPr>
+        <w:pStyle w:val="SourceCode"/>
+      </w:pPr>
+      <w:r>
+        <w:rPr>
+          <w:rStyle w:val="FunctionTok"/>
+        </w:rPr>
+        <w:t xml:space="preserve">git</w:t>
+      </w:r>
+      <w:r>
+        <w:rPr>
+          <w:rStyle w:val="NormalTok"/>
+        </w:rPr>
+        <w:t xml:space="preserve"> branch          </w:t>
+      </w:r>
+      <w:r>
+        <w:rPr>
+          <w:rStyle w:val="CommentTok"/>
+        </w:rPr>
+        <w:t xml:space="preserve"># ¿cómo se llama tu rama actual?</w:t>
+      </w:r>
+      <w:r>
+        <w:br/>
+      </w:r>
+      <w:r>
+        <w:rPr>
+          <w:rStyle w:val="FunctionTok"/>
+        </w:rPr>
+        <w:t xml:space="preserve">git</w:t>
+      </w:r>
+      <w:r>
+        <w:rPr>
+          <w:rStyle w:val="NormalTok"/>
+        </w:rPr>
+        <w:t xml:space="preserve"> remote </w:t>
+      </w:r>
+      <w:r>
+        <w:rPr>
+          <w:rStyle w:val="AttributeTok"/>
+        </w:rPr>
+        <w:t xml:space="preserve">-v</w:t>
+      </w:r>
+      <w:r>
+        <w:rPr>
+          <w:rStyle w:val="NormalTok"/>
+        </w:rPr>
+        <w:t xml:space="preserve">       </w:t>
+      </w:r>
+      <w:r>
+        <w:rPr>
+          <w:rStyle w:val="CommentTok"/>
+        </w:rPr>
+        <w:t xml:space="preserve"># ¿a qué URL está conectado "origin"?</w:t>
+      </w:r>
+      <w:r>
+        <w:br/>
+      </w:r>
+      <w:r>
+        <w:rPr>
+          <w:rStyle w:val="FunctionTok"/>
+        </w:rPr>
+        <w:t xml:space="preserve">git</w:t>
+      </w:r>
+      <w:r>
+        <w:rPr>
+          <w:rStyle w:val="NormalTok"/>
+        </w:rPr>
+        <w:t xml:space="preserve"> log </w:t>
+      </w:r>
+      <w:r>
+        <w:rPr>
+          <w:rStyle w:val="AttributeTok"/>
+        </w:rPr>
+        <w:t xml:space="preserve">--oneline</w:t>
+      </w:r>
+      <w:r>
+        <w:rPr>
+          <w:rStyle w:val="NormalTok"/>
+        </w:rPr>
+        <w:t xml:space="preserve">   </w:t>
+      </w:r>
+      <w:r>
+        <w:rPr>
+          <w:rStyle w:val="CommentTok"/>
+        </w:rPr>
+        <w:t xml:space="preserve"># ¿ya tienes al menos un commit?</w:t>
+      </w:r>
+    </w:p>
+    <w:p>
+      <w:pPr>
+        <w:pStyle w:val="FirstParagraph"/>
+      </w:pPr>
+      <w:r>
+        <w:rPr>
+          <w:b/>
+          <w:bCs/>
+        </w:rPr>
+        <w:t xml:space="preserve">Causa #1 (la más común, por mucho): el nombre de la rama no coincide.</w:t>
+      </w:r>
+      <w:r>
+        <w:t xml:space="preserve"> </w:t>
+      </w:r>
+      <w:r>
+        <w:rPr>
+          <w:rStyle w:val="VerbatimChar"/>
+        </w:rPr>
+        <w:t xml:space="preserve">git init</w:t>
+      </w:r>
+      <w:r>
+        <w:t xml:space="preserve"> </w:t>
+      </w:r>
+      <w:r>
+        <w:t xml:space="preserve">crea tu rama local llamada</w:t>
+      </w:r>
+      <w:r>
+        <w:t xml:space="preserve"> </w:t>
+      </w:r>
+      <w:r>
+        <w:rPr>
+          <w:rStyle w:val="VerbatimChar"/>
+          <w:b/>
+          <w:bCs/>
+        </w:rPr>
+        <w:t xml:space="preserve">master</w:t>
+      </w:r>
+      <w:r>
+        <w:t xml:space="preserve"> </w:t>
+      </w:r>
+      <w:r>
+        <w:t xml:space="preserve">por defecto, salvo que tengas configurado lo contrario — pero GitHub, desde 2020, usa</w:t>
+      </w:r>
+      <w:r>
+        <w:t xml:space="preserve"> </w:t>
+      </w:r>
+      <w:r>
+        <w:rPr>
+          <w:rStyle w:val="VerbatimChar"/>
+          <w:b/>
+          <w:bCs/>
+        </w:rPr>
+        <w:t xml:space="preserve">main</w:t>
+      </w:r>
+      <w:r>
+        <w:t xml:space="preserve"> </w:t>
+      </w:r>
+      <w:r>
+        <w:t xml:space="preserve">por defecto en repositorios nuevos. Si le pides a Git que suba</w:t>
+      </w:r>
+      <w:r>
+        <w:t xml:space="preserve"> </w:t>
+      </w:r>
+      <w:r>
+        <w:rPr>
+          <w:rStyle w:val="VerbatimChar"/>
+        </w:rPr>
+        <w:t xml:space="preserve">main</w:t>
+      </w:r>
+      <w:r>
+        <w:t xml:space="preserve"> </w:t>
+      </w:r>
+      <w:r>
+        <w:t xml:space="preserve">y tu rama local se llama</w:t>
+      </w:r>
+      <w:r>
+        <w:t xml:space="preserve"> </w:t>
+      </w:r>
+      <w:r>
+        <w:rPr>
+          <w:rStyle w:val="VerbatimChar"/>
+        </w:rPr>
+        <w:t xml:space="preserve">master</w:t>
+      </w:r>
+      <w:r>
+        <w:t xml:space="preserve">, verás:</w:t>
+      </w:r>
+    </w:p>
+    <w:p>
+      <w:pPr>
+        <w:pStyle w:val="SourceCode"/>
+      </w:pPr>
+      <w:r>
+        <w:rPr>
+          <w:rStyle w:val="VerbatimChar"/>
+        </w:rPr>
+        <w:t xml:space="preserve">error: src refspec main does not match any file(s) known to it</w:t>
+      </w:r>
+    </w:p>
+    <w:p>
+      <w:pPr>
+        <w:pStyle w:val="FirstParagraph"/>
+      </w:pPr>
+      <w:r>
+        <w:t xml:space="preserve">Solución: fuerza el nombre de tu rama antes del push (funciona sin importar cómo se llamaba antes):</w:t>
+      </w:r>
+    </w:p>
+    <w:p>
+      <w:pPr>
+        <w:pStyle w:val="SourceCode"/>
+      </w:pPr>
+      <w:r>
+        <w:rPr>
+          <w:rStyle w:val="FunctionTok"/>
+        </w:rPr>
+        <w:t xml:space="preserve">git</w:t>
+      </w:r>
+      <w:r>
+        <w:rPr>
+          <w:rStyle w:val="NormalTok"/>
+        </w:rPr>
+        <w:t xml:space="preserve"> branch </w:t>
+      </w:r>
+      <w:r>
+        <w:rPr>
+          <w:rStyle w:val="AttributeTok"/>
+        </w:rPr>
+        <w:t xml:space="preserve">-M</w:t>
+      </w:r>
+      <w:r>
+        <w:rPr>
+          <w:rStyle w:val="NormalTok"/>
+        </w:rPr>
+        <w:t xml:space="preserve"> main</w:t>
+      </w:r>
+      <w:r>
+        <w:br/>
+      </w:r>
+      <w:r>
+        <w:rPr>
+          <w:rStyle w:val="FunctionTok"/>
+        </w:rPr>
+        <w:t xml:space="preserve">git</w:t>
+      </w:r>
+      <w:r>
+        <w:rPr>
+          <w:rStyle w:val="NormalTok"/>
+        </w:rPr>
+        <w:t xml:space="preserve"> push </w:t>
+      </w:r>
+      <w:r>
+        <w:rPr>
+          <w:rStyle w:val="AttributeTok"/>
+        </w:rPr>
+        <w:t xml:space="preserve">-u</w:t>
+      </w:r>
+      <w:r>
+        <w:rPr>
+          <w:rStyle w:val="NormalTok"/>
+        </w:rPr>
+        <w:t xml:space="preserve"> origin main</w:t>
+      </w:r>
+    </w:p>
+    <w:p>
+      <w:pPr>
+        <w:pStyle w:val="FirstParagraph"/>
+      </w:pPr>
+      <w:r>
+        <w:rPr>
+          <w:b/>
+          <w:bCs/>
+        </w:rPr>
+        <w:t xml:space="preserve">Causa #2: el repositorio de GitHub no está realmente vacío.</w:t>
+      </w:r>
+      <w:r>
+        <w:t xml:space="preserve"> </w:t>
+      </w:r>
+      <w:r>
+        <w:t xml:space="preserve">Si al crearlo marcaste</w:t>
+      </w:r>
+      <w:r>
+        <w:t xml:space="preserve"> </w:t>
+      </w:r>
+      <w:r>
+        <w:t xml:space="preserve">“Add a README file”</w:t>
+      </w:r>
+      <w:r>
+        <w:t xml:space="preserve"> </w:t>
+      </w:r>
+      <w:r>
+        <w:t xml:space="preserve">(o</w:t>
+      </w:r>
+      <w:r>
+        <w:t xml:space="preserve"> </w:t>
+      </w:r>
+      <w:r>
+        <w:rPr>
+          <w:rStyle w:val="VerbatimChar"/>
+        </w:rPr>
+        <w:t xml:space="preserve">.gitignore</w:t>
+      </w:r>
+      <w:r>
+        <w:t xml:space="preserve"> </w:t>
+      </w:r>
+      <w:r>
+        <w:t xml:space="preserve">o licencia), GitHub ya generó un primer commit ahí, sin relación con tu historial local. Verás:</w:t>
+      </w:r>
+    </w:p>
+    <w:p>
+      <w:pPr>
+        <w:pStyle w:val="SourceCode"/>
+      </w:pPr>
+      <w:r>
+        <w:rPr>
+          <w:rStyle w:val="VerbatimChar"/>
+        </w:rPr>
+        <w:t xml:space="preserve">! [rejected]        main -&gt; main (fetch first)</w:t>
+      </w:r>
+      <w:r>
+        <w:br/>
+      </w:r>
+      <w:r>
+        <w:rPr>
+          <w:rStyle w:val="VerbatimChar"/>
+        </w:rPr>
+        <w:t xml:space="preserve">hint: Updates were rejected because the remote contains work that you do not have locally.</w:t>
+      </w:r>
+    </w:p>
+    <w:p>
+      <w:pPr>
+        <w:pStyle w:val="FirstParagraph"/>
+      </w:pPr>
+      <w:r>
+        <w:t xml:space="preserve">Solución A (la más simple): borra ese repositorio en GitHub y créalo de nuevo</w:t>
+      </w:r>
+      <w:r>
+        <w:t xml:space="preserve"> </w:t>
+      </w:r>
+      <w:r>
+        <w:rPr>
+          <w:b/>
+          <w:bCs/>
+        </w:rPr>
+        <w:t xml:space="preserve">sin marcar ninguna casilla</w:t>
+      </w:r>
+      <w:r>
+        <w:t xml:space="preserve">, para que quede completamente vacío.</w:t>
+      </w:r>
+      <w:r>
+        <w:t xml:space="preserve"> </w:t>
+      </w:r>
+      <w:r>
+        <w:t xml:space="preserve">Solución B (si no quieres borrarlo): combina los historiales:</w:t>
+      </w:r>
+    </w:p>
+    <w:p>
+      <w:pPr>
+        <w:pStyle w:val="SourceCode"/>
+      </w:pPr>
+      <w:r>
+        <w:rPr>
+          <w:rStyle w:val="FunctionTok"/>
+        </w:rPr>
+        <w:t xml:space="preserve">git</w:t>
+      </w:r>
+      <w:r>
+        <w:rPr>
+          <w:rStyle w:val="NormalTok"/>
+        </w:rPr>
+        <w:t xml:space="preserve"> pull origin main </w:t>
+      </w:r>
+      <w:r>
+        <w:rPr>
+          <w:rStyle w:val="AttributeTok"/>
+        </w:rPr>
+        <w:t xml:space="preserve">--allow-unrelated-histories</w:t>
+      </w:r>
+      <w:r>
+        <w:br/>
+      </w:r>
+      <w:r>
+        <w:rPr>
+          <w:rStyle w:val="FunctionTok"/>
+        </w:rPr>
+        <w:t xml:space="preserve">git</w:t>
+      </w:r>
+      <w:r>
+        <w:rPr>
+          <w:rStyle w:val="NormalTok"/>
+        </w:rPr>
+        <w:t xml:space="preserve"> push </w:t>
+      </w:r>
+      <w:r>
+        <w:rPr>
+          <w:rStyle w:val="AttributeTok"/>
+        </w:rPr>
+        <w:t xml:space="preserve">-u</w:t>
+      </w:r>
+      <w:r>
+        <w:rPr>
+          <w:rStyle w:val="NormalTok"/>
+        </w:rPr>
+        <w:t xml:space="preserve"> origin main</w:t>
+      </w:r>
+    </w:p>
+    <w:p>
+      <w:pPr>
+        <w:pStyle w:val="FirstParagraph"/>
+      </w:pPr>
+      <w:r>
+        <w:rPr>
+          <w:b/>
+          <w:bCs/>
+        </w:rPr>
+        <w:t xml:space="preserve">Causa #3: falla de autenticación.</w:t>
+      </w:r>
+    </w:p>
+    <w:p>
+      <w:pPr>
+        <w:pStyle w:val="SourceCode"/>
+      </w:pPr>
+      <w:r>
+        <w:rPr>
+          <w:rStyle w:val="VerbatimChar"/>
+        </w:rPr>
+        <w:t xml:space="preserve">remote: Support for password authentication was removed on August 13, 2021.</w:t>
+      </w:r>
+      <w:r>
+        <w:br/>
+      </w:r>
+      <w:r>
+        <w:rPr>
+          <w:rStyle w:val="VerbatimChar"/>
+        </w:rPr>
+        <w:t xml:space="preserve">fatal: Authentication failed</w:t>
+      </w:r>
+    </w:p>
+    <w:p>
+      <w:pPr>
+        <w:pStyle w:val="FirstParagraph"/>
+      </w:pPr>
+      <w:r>
+        <w:t xml:space="preserve">GitHub ya no acepta tu contraseña normal por terminal. Si te pide usuario y contraseña, en el campo de</w:t>
+      </w:r>
+      <w:r>
+        <w:t xml:space="preserve"> </w:t>
+      </w:r>
+      <w:r>
+        <w:t xml:space="preserve">“contraseña”</w:t>
+      </w:r>
+      <w:r>
+        <w:t xml:space="preserve"> </w:t>
+      </w:r>
+      <w:r>
+        <w:t xml:space="preserve">debes pegar tu</w:t>
+      </w:r>
+      <w:r>
+        <w:t xml:space="preserve"> </w:t>
+      </w:r>
+      <w:r>
+        <w:rPr>
+          <w:b/>
+          <w:bCs/>
+        </w:rPr>
+        <w:t xml:space="preserve">token de acceso personal</w:t>
+      </w:r>
+      <w:r>
+        <w:t xml:space="preserve"> </w:t>
+      </w:r>
+      <w:r>
+        <w:t xml:space="preserve">(sección 2.4), no tu contraseña real de GitHub.</w:t>
+      </w:r>
+    </w:p>
+    <w:p>
+      <w:pPr>
+        <w:pStyle w:val="BodyText"/>
+      </w:pPr>
+      <w:r>
+        <w:rPr>
+          <w:b/>
+          <w:bCs/>
+        </w:rPr>
+        <w:t xml:space="preserve">Causa #4: la URL del remoto está mal o no se agregó.</w:t>
+      </w:r>
+    </w:p>
+    <w:p>
+      <w:pPr>
+        <w:pStyle w:val="SourceCode"/>
+      </w:pPr>
+      <w:r>
+        <w:rPr>
+          <w:rStyle w:val="VerbatimChar"/>
+        </w:rPr>
+        <w:t xml:space="preserve">fatal: 'origin' does not appear to be a git repository</w:t>
+      </w:r>
+    </w:p>
+    <w:p>
+      <w:pPr>
+        <w:pStyle w:val="FirstParagraph"/>
+      </w:pPr>
+      <w:r>
+        <w:t xml:space="preserve">o</w:t>
+      </w:r>
+    </w:p>
+    <w:p>
+      <w:pPr>
+        <w:pStyle w:val="SourceCode"/>
+      </w:pPr>
+      <w:r>
+        <w:rPr>
+          <w:rStyle w:val="VerbatimChar"/>
+        </w:rPr>
+        <w:t xml:space="preserve">fatal: remote origin already exists</w:t>
+      </w:r>
+    </w:p>
+    <w:p>
+      <w:pPr>
+        <w:pStyle w:val="FirstParagraph"/>
+      </w:pPr>
+      <w:r>
+        <w:t xml:space="preserve">Solución:</w:t>
+      </w:r>
+    </w:p>
+    <w:p>
+      <w:pPr>
+        <w:pStyle w:val="SourceCode"/>
+      </w:pPr>
+      <w:r>
+        <w:rPr>
+          <w:rStyle w:val="FunctionTok"/>
+        </w:rPr>
+        <w:t xml:space="preserve">git</w:t>
+      </w:r>
+      <w:r>
+        <w:rPr>
+          <w:rStyle w:val="NormalTok"/>
+        </w:rPr>
+        <w:t xml:space="preserve"> remote </w:t>
+      </w:r>
+      <w:r>
+        <w:rPr>
+          <w:rStyle w:val="AttributeTok"/>
+        </w:rPr>
+        <w:t xml:space="preserve">-v</w:t>
+      </w:r>
+      <w:r>
+        <w:rPr>
+          <w:rStyle w:val="NormalTok"/>
+        </w:rPr>
+        <w:t xml:space="preserve">                                    </w:t>
+      </w:r>
+      <w:r>
+        <w:rPr>
+          <w:rStyle w:val="CommentTok"/>
+        </w:rPr>
+        <w:t xml:space="preserve"># revisa qué hay configurado</w:t>
+      </w:r>
+      <w:r>
+        <w:br/>
+      </w:r>
+      <w:r>
+        <w:rPr>
+          <w:rStyle w:val="FunctionTok"/>
+        </w:rPr>
+        <w:t xml:space="preserve">git</w:t>
+      </w:r>
+      <w:r>
+        <w:rPr>
+          <w:rStyle w:val="NormalTok"/>
+        </w:rPr>
+        <w:t xml:space="preserve"> remote remove origin                         </w:t>
+      </w:r>
+      <w:r>
+        <w:rPr>
+          <w:rStyle w:val="CommentTok"/>
+        </w:rPr>
+        <w:t xml:space="preserve"># si está mal, lo quitas</w:t>
+      </w:r>
+      <w:r>
+        <w:br/>
+      </w:r>
+      <w:r>
+        <w:rPr>
+          <w:rStyle w:val="FunctionTok"/>
+        </w:rPr>
+        <w:t xml:space="preserve">git</w:t>
+      </w:r>
+      <w:r>
+        <w:rPr>
+          <w:rStyle w:val="NormalTok"/>
+        </w:rPr>
+        <w:t xml:space="preserve"> remote add origin https://github.com/tu-usuario/tu-repo.git   </w:t>
+      </w:r>
+      <w:r>
+        <w:rPr>
+          <w:rStyle w:val="CommentTok"/>
+        </w:rPr>
+        <w:t xml:space="preserve"># y lo agregas bien</w:t>
+      </w:r>
+    </w:p>
+    <w:p>
+      <w:pPr>
+        <w:pStyle w:val="FirstParagraph"/>
+      </w:pPr>
+      <w:r>
+        <w:rPr>
+          <w:b/>
+          <w:bCs/>
+        </w:rPr>
+        <w:t xml:space="preserve">El procedimiento completo, en el orden que evita las 4 causas de una sola pasada:</w:t>
+      </w:r>
+    </w:p>
+    <w:p>
+      <w:pPr>
+        <w:pStyle w:val="SourceCode"/>
+      </w:pPr>
+      <w:r>
+        <w:rPr>
+          <w:rStyle w:val="FunctionTok"/>
+        </w:rPr>
+        <w:t xml:space="preserve">git</w:t>
+      </w:r>
+      <w:r>
+        <w:rPr>
+          <w:rStyle w:val="NormalTok"/>
+        </w:rPr>
+        <w:t xml:space="preserve"> log </w:t>
+      </w:r>
+      <w:r>
+        <w:rPr>
+          <w:rStyle w:val="AttributeTok"/>
+        </w:rPr>
+        <w:t xml:space="preserve">--oneline</w:t>
+      </w:r>
+      <w:r>
+        <w:rPr>
+          <w:rStyle w:val="NormalTok"/>
+        </w:rPr>
+        <w:t xml:space="preserve">                </w:t>
+      </w:r>
+      <w:r>
+        <w:rPr>
+          <w:rStyle w:val="CommentTok"/>
+        </w:rPr>
+        <w:t xml:space="preserve"># 1. confirma que ya tienes al menos un commit</w:t>
+      </w:r>
+      <w:r>
+        <w:br/>
+      </w:r>
+      <w:r>
+        <w:rPr>
+          <w:rStyle w:val="FunctionTok"/>
+        </w:rPr>
+        <w:t xml:space="preserve">git</w:t>
+      </w:r>
+      <w:r>
+        <w:rPr>
+          <w:rStyle w:val="NormalTok"/>
+        </w:rPr>
+        <w:t xml:space="preserve"> branch </w:t>
+      </w:r>
+      <w:r>
+        <w:rPr>
+          <w:rStyle w:val="AttributeTok"/>
+        </w:rPr>
+        <w:t xml:space="preserve">-M</w:t>
+      </w:r>
+      <w:r>
+        <w:rPr>
+          <w:rStyle w:val="NormalTok"/>
+        </w:rPr>
+        <w:t xml:space="preserve"> main                </w:t>
+      </w:r>
+      <w:r>
+        <w:rPr>
+          <w:rStyle w:val="CommentTok"/>
+        </w:rPr>
+        <w:t xml:space="preserve"># 2. fuerza que tu rama se llame "main"</w:t>
+      </w:r>
+      <w:r>
+        <w:br/>
+      </w:r>
+      <w:r>
+        <w:rPr>
+          <w:rStyle w:val="FunctionTok"/>
+        </w:rPr>
+        <w:t xml:space="preserve">git</w:t>
+      </w:r>
+      <w:r>
+        <w:rPr>
+          <w:rStyle w:val="NormalTok"/>
+        </w:rPr>
+        <w:t xml:space="preserve"> remote </w:t>
+      </w:r>
+      <w:r>
+        <w:rPr>
+          <w:rStyle w:val="AttributeTok"/>
+        </w:rPr>
+        <w:t xml:space="preserve">-v</w:t>
+      </w:r>
+      <w:r>
+        <w:rPr>
+          <w:rStyle w:val="NormalTok"/>
+        </w:rPr>
+        <w:t xml:space="preserve">                     </w:t>
+      </w:r>
+      <w:r>
+        <w:rPr>
+          <w:rStyle w:val="CommentTok"/>
+        </w:rPr>
+        <w:t xml:space="preserve"># 3. revisa que "origin" apunte a la URL correcta</w:t>
+      </w:r>
+      <w:r>
+        <w:br/>
+      </w:r>
+      <w:r>
+        <w:rPr>
+          <w:rStyle w:val="FunctionTok"/>
+        </w:rPr>
+        <w:t xml:space="preserve">git</w:t>
+      </w:r>
+      <w:r>
+        <w:rPr>
+          <w:rStyle w:val="NormalTok"/>
+        </w:rPr>
+        <w:t xml:space="preserve"> push </w:t>
+      </w:r>
+      <w:r>
+        <w:rPr>
+          <w:rStyle w:val="AttributeTok"/>
+        </w:rPr>
+        <w:t xml:space="preserve">-u</w:t>
+      </w:r>
+      <w:r>
+        <w:rPr>
+          <w:rStyle w:val="NormalTok"/>
+        </w:rPr>
+        <w:t xml:space="preserve"> origin main           </w:t>
+      </w:r>
+      <w:r>
+        <w:rPr>
+          <w:rStyle w:val="CommentTok"/>
+        </w:rPr>
+        <w:t xml:space="preserve"># 4. empuja tus cambios</w:t>
+      </w:r>
+    </w:p>
+    <w:p>
+      <w:pPr>
+        <w:pStyle w:val="FirstParagraph"/>
+      </w:pPr>
+      <w:r>
+        <w:t xml:space="preserve">Si después de esto el error persiste, el mensaje de error exacto (copiado tal cual) casi siempre indica la causa con precisión, aunque no sea ninguna de las cuatro anteriores.</w:t>
+      </w:r>
+    </w:p>
     <w:p>
       <w:r>
         <w:pict>
@@ -1536,9 +2321,9 @@
         </w:pict>
       </w:r>
     </w:p>
-    <w:bookmarkEnd w:id="17"/>
     <w:bookmarkEnd w:id="18"/>
-    <w:bookmarkStart w:id="19" w:name="qué-problema-resuelve-git"/>
+    <w:bookmarkEnd w:id="19"/>
+    <w:bookmarkStart w:id="20" w:name="qué-problema-resuelve-git"/>
     <w:p>
       <w:pPr>
         <w:pStyle w:val="Heading2"/>
@@ -1724,8 +2509,8 @@
         </w:pict>
       </w:r>
     </w:p>
-    <w:bookmarkEnd w:id="19"/>
-    <w:bookmarkStart w:id="26" w:name="Xa2ec91b6126d5250f9b2a8434414cdb60ad465e"/>
+    <w:bookmarkEnd w:id="20"/>
+    <w:bookmarkStart w:id="27" w:name="Xa2ec91b6126d5250f9b2a8434414cdb60ad465e"/>
     <w:p>
       <w:pPr>
         <w:pStyle w:val="Heading2"/>
@@ -1742,7 +2527,7 @@
         <w:t xml:space="preserve">Antes de ver comandos, hay que entender el vocabulario. Estos son los conceptos que forman la base de todo lo demás:</w:t>
       </w:r>
     </w:p>
-    <w:bookmarkStart w:id="20" w:name="repositorio-repo"/>
+    <w:bookmarkStart w:id="21" w:name="repositorio-repo"/>
     <w:p>
       <w:pPr>
         <w:pStyle w:val="Heading3"/>
@@ -1780,8 +2565,8 @@
         <w:t xml:space="preserve">.</w:t>
       </w:r>
     </w:p>
-    <w:bookmarkEnd w:id="20"/>
-    <w:bookmarkStart w:id="21" w:name="commit"/>
+    <w:bookmarkEnd w:id="21"/>
+    <w:bookmarkStart w:id="22" w:name="commit"/>
     <w:p>
       <w:pPr>
         <w:pStyle w:val="Heading3"/>
@@ -1818,8 +2603,8 @@
         <w:t xml:space="preserve">Analogía: si tu proyecto fuera una película, cada commit sería un fotograma. Puedes regresar a ver cualquier fotograma anterior cuando quieras.</w:t>
       </w:r>
     </w:p>
-    <w:bookmarkEnd w:id="21"/>
-    <w:bookmarkStart w:id="22" w:name="staging-area-área-de-preparación"/>
+    <w:bookmarkEnd w:id="22"/>
+    <w:bookmarkStart w:id="23" w:name="staging-area-área-de-preparación"/>
     <w:p>
       <w:pPr>
         <w:pStyle w:val="Heading3"/>
@@ -1881,8 +2666,8 @@
         <w:t xml:space="preserve">Analogía: es como armar una caja para enviar por correo. Primero eliges qué cosas van dentro de la caja (staging), y luego sellas la caja (commit).</w:t>
       </w:r>
     </w:p>
-    <w:bookmarkEnd w:id="22"/>
-    <w:bookmarkStart w:id="23" w:name="working-directory-directorio-de-trabajo"/>
+    <w:bookmarkEnd w:id="23"/>
+    <w:bookmarkStart w:id="24" w:name="working-directory-directorio-de-trabajo"/>
     <w:p>
       <w:pPr>
         <w:pStyle w:val="Heading3"/>
@@ -1899,8 +2684,8 @@
         <w:t xml:space="preserve">Los archivos tal como están en tu computadora en este momento, con los cambios que aún no has guardado en ningún commit.</w:t>
       </w:r>
     </w:p>
-    <w:bookmarkEnd w:id="23"/>
-    <w:bookmarkStart w:id="24" w:name="branch-rama"/>
+    <w:bookmarkEnd w:id="24"/>
+    <w:bookmarkStart w:id="25" w:name="branch-rama"/>
     <w:p>
       <w:pPr>
         <w:pStyle w:val="Heading3"/>
@@ -1971,8 +2756,8 @@
         <w:t xml:space="preserve">Analogía: es como escribir un borrador en una hoja aparte antes de pasarlo en limpio al cuaderno bueno. Si el borrador no funciona, simplemente lo desechas; el cuaderno bueno nunca se vio afectado.</w:t>
       </w:r>
     </w:p>
-    <w:bookmarkEnd w:id="24"/>
-    <w:bookmarkStart w:id="25" w:name="remoto-remote"/>
+    <w:bookmarkEnd w:id="25"/>
+    <w:bookmarkStart w:id="26" w:name="remoto-remote"/>
     <w:p>
       <w:pPr>
         <w:pStyle w:val="Heading3"/>
@@ -2008,9 +2793,9 @@
         </w:pict>
       </w:r>
     </w:p>
-    <w:bookmarkEnd w:id="25"/>
     <w:bookmarkEnd w:id="26"/>
-    <w:bookmarkStart w:id="31" w:name="Xe0633c4841cbd6f29ca697db729cf20fcbecbac"/>
+    <w:bookmarkEnd w:id="27"/>
+    <w:bookmarkStart w:id="32" w:name="Xe0633c4841cbd6f29ca697db729cf20fcbecbac"/>
     <w:p>
       <w:pPr>
         <w:pStyle w:val="Heading2"/>
@@ -2019,7 +2804,7 @@
         <w:t xml:space="preserve">5. Ramas a fondo: el concepto que más cuesta al principio</w:t>
       </w:r>
     </w:p>
-    <w:bookmarkStart w:id="27" w:name="qué-es-una-rama-en-realidad"/>
+    <w:bookmarkStart w:id="28" w:name="qué-es-una-rama-en-realidad"/>
     <w:p>
       <w:pPr>
         <w:pStyle w:val="Heading3"/>
@@ -2233,8 +3018,8 @@
         <w:t xml:space="preserve">C1 --- C2 --- C3 --- C6 (main)</w:t>
       </w:r>
     </w:p>
-    <w:bookmarkEnd w:id="27"/>
-    <w:bookmarkStart w:id="28" w:name="por-qué-existen-las-ramas"/>
+    <w:bookmarkEnd w:id="28"/>
+    <w:bookmarkStart w:id="29" w:name="por-qué-existen-las-ramas"/>
     <w:p>
       <w:pPr>
         <w:pStyle w:val="Heading3"/>
@@ -2273,8 +3058,8 @@
         <w:t xml:space="preserve">) siempre estable, mientras el trabajo en progreso ocurre en otro lado.</w:t>
       </w:r>
     </w:p>
-    <w:bookmarkEnd w:id="28"/>
-    <w:bookmarkStart w:id="29" w:name="comandos-básicos"/>
+    <w:bookmarkEnd w:id="29"/>
+    <w:bookmarkStart w:id="30" w:name="comandos-básicos"/>
     <w:p>
       <w:pPr>
         <w:pStyle w:val="Heading3"/>
@@ -2459,8 +3244,8 @@
         <w:t xml:space="preserve"># borrar una rama que ya no necesitas (una vez fusionada)</w:t>
       </w:r>
     </w:p>
-    <w:bookmarkEnd w:id="29"/>
-    <w:bookmarkStart w:id="30" w:name="el-flujo-típico-con-una-rama"/>
+    <w:bookmarkEnd w:id="30"/>
+    <w:bookmarkStart w:id="31" w:name="el-flujo-típico-con-una-rama"/>
     <w:p>
       <w:pPr>
         <w:pStyle w:val="Heading3"/>
@@ -2646,9 +3431,9 @@
         </w:pict>
       </w:r>
     </w:p>
-    <w:bookmarkEnd w:id="30"/>
     <w:bookmarkEnd w:id="31"/>
-    <w:bookmarkStart w:id="37" w:name="cinco-casos-de-uso-reales-de-las-ramas"/>
+    <w:bookmarkEnd w:id="32"/>
+    <w:bookmarkStart w:id="38" w:name="cinco-casos-de-uso-reales-de-las-ramas"/>
     <w:p>
       <w:pPr>
         <w:pStyle w:val="Heading2"/>
@@ -2657,7 +3442,7 @@
         <w:t xml:space="preserve">6. Cinco casos de uso reales de las ramas</w:t>
       </w:r>
     </w:p>
-    <w:bookmarkStart w:id="32" w:name="Xece329b63c297f006ee7ebf464a9713ce0f5535"/>
+    <w:bookmarkStart w:id="33" w:name="Xece329b63c297f006ee7ebf464a9713ce0f5535"/>
     <w:p>
       <w:pPr>
         <w:pStyle w:val="Heading3"/>
@@ -2753,8 +3538,8 @@
         <w:t xml:space="preserve">.</w:t>
       </w:r>
     </w:p>
-    <w:bookmarkEnd w:id="32"/>
-    <w:bookmarkStart w:id="33" w:name="X3faf35286862f18f09cd240df400b87d1f60a50"/>
+    <w:bookmarkEnd w:id="33"/>
+    <w:bookmarkStart w:id="34" w:name="X3faf35286862f18f09cd240df400b87d1f60a50"/>
     <w:p>
       <w:pPr>
         <w:pStyle w:val="Heading3"/>
@@ -2959,8 +3744,8 @@
         <w:t xml:space="preserve">existe solo el tiempo necesario para resolver el problema puntual.</w:t>
       </w:r>
     </w:p>
-    <w:bookmarkEnd w:id="33"/>
-    <w:bookmarkStart w:id="34" w:name="Xfcc14a024a0b9aa317c4656748304b2182043ae"/>
+    <w:bookmarkEnd w:id="34"/>
+    <w:bookmarkStart w:id="35" w:name="Xfcc14a024a0b9aa317c4656748304b2182043ae"/>
     <w:p>
       <w:pPr>
         <w:pStyle w:val="Heading3"/>
@@ -3066,8 +3851,8 @@
         <w:t xml:space="preserve">nunca se enteró de tu experimento.</w:t>
       </w:r>
     </w:p>
-    <w:bookmarkEnd w:id="34"/>
-    <w:bookmarkStart w:id="35" w:name="Xc9bd3e4254e52a84deafe7837f361c626284958"/>
+    <w:bookmarkEnd w:id="35"/>
+    <w:bookmarkStart w:id="36" w:name="Xc9bd3e4254e52a84deafe7837f361c626284958"/>
     <w:p>
       <w:pPr>
         <w:pStyle w:val="Heading3"/>
@@ -3263,8 +4048,8 @@
         <w:t xml:space="preserve">nunca tiene código a medias de nadie.</w:t>
       </w:r>
     </w:p>
-    <w:bookmarkEnd w:id="35"/>
-    <w:bookmarkStart w:id="36" w:name="Xe29e6de39b12e9e4cfa04ce779e89bee4645f01"/>
+    <w:bookmarkEnd w:id="36"/>
+    <w:bookmarkStart w:id="37" w:name="Xe29e6de39b12e9e4cfa04ce779e89bee4645f01"/>
     <w:p>
       <w:pPr>
         <w:pStyle w:val="Heading3"/>
@@ -3411,9 +4196,9 @@
         </w:pict>
       </w:r>
     </w:p>
-    <w:bookmarkEnd w:id="36"/>
     <w:bookmarkEnd w:id="37"/>
-    <w:bookmarkStart w:id="41" w:name="Xd1065b6ad39287d64a483c21741f63ce815ed33"/>
+    <w:bookmarkEnd w:id="38"/>
+    <w:bookmarkStart w:id="42" w:name="Xd1065b6ad39287d64a483c21741f63ce815ed33"/>
     <w:p>
       <w:pPr>
         <w:pStyle w:val="Heading2"/>
@@ -3430,7 +4215,7 @@
         <w:t xml:space="preserve">Esta es la pregunta natural una vez que tu característica ya funciona y el equipo la aprobó. Hay dos caminos: hacerlo directo por línea de comandos (útil cuando trabajas solo), o hacerlo a través de GitHub con un Pull Request (lo normal cuando trabajas en equipo). Vale la pena entender ambos.</w:t>
       </w:r>
     </w:p>
-    <w:bookmarkStart w:id="38" w:name="X4cf54c757fc5853d6087f33db31bbc640c1571e"/>
+    <w:bookmarkStart w:id="39" w:name="X4cf54c757fc5853d6087f33db31bbc640c1571e"/>
     <w:p>
       <w:pPr>
         <w:pStyle w:val="Heading3"/>
@@ -3831,8 +4616,8 @@
         <w:t xml:space="preserve">                         C4 ------- C5 (tu-rama)</w:t>
       </w:r>
     </w:p>
-    <w:bookmarkEnd w:id="38"/>
-    <w:bookmarkStart w:id="39" w:name="Xfcb069e37db7372913c8f7b615f27c072218958"/>
+    <w:bookmarkEnd w:id="39"/>
+    <w:bookmarkStart w:id="40" w:name="Xfcb069e37db7372913c8f7b615f27c072218958"/>
     <w:p>
       <w:pPr>
         <w:pStyle w:val="Heading3"/>
@@ -4342,8 +5127,8 @@
         <w:t xml:space="preserve"> pull</w:t>
       </w:r>
     </w:p>
-    <w:bookmarkEnd w:id="39"/>
-    <w:bookmarkStart w:id="40" w:name="y-si-hay-un-conflicto"/>
+    <w:bookmarkEnd w:id="40"/>
+    <w:bookmarkStart w:id="41" w:name="y-si-hay-un-conflicto"/>
     <w:p>
       <w:pPr>
         <w:pStyle w:val="Heading3"/>
@@ -4633,9 +5418,9 @@
         </w:pict>
       </w:r>
     </w:p>
-    <w:bookmarkEnd w:id="40"/>
     <w:bookmarkEnd w:id="41"/>
-    <w:bookmarkStart w:id="42" w:name="Xc3167339eee1cd5d7dad3ac8f0d0d977a597d0d"/>
+    <w:bookmarkEnd w:id="42"/>
+    <w:bookmarkStart w:id="43" w:name="Xc3167339eee1cd5d7dad3ac8f0d0d977a597d0d"/>
     <w:p>
       <w:pPr>
         <w:pStyle w:val="Heading2"/>
@@ -4933,14 +5718,26 @@
         </w:pict>
       </w:r>
     </w:p>
-    <w:bookmarkEnd w:id="42"/>
-    <w:bookmarkStart w:id="46" w:name="dónde-entra-github"/>
+    <w:bookmarkEnd w:id="43"/>
+    <w:bookmarkStart w:id="46" w:name="X0533c17fbb140f7869aaf1917cc6ea8d677b1e3"/>
     <w:p>
       <w:pPr>
         <w:pStyle w:val="Heading2"/>
       </w:pPr>
       <w:r>
-        <w:t xml:space="preserve">9. ¿Dónde entra GitHub?</w:t>
+        <w:t xml:space="preserve">9. Lo contrario de</w:t>
+      </w:r>
+      <w:r>
+        <w:t xml:space="preserve"> </w:t>
+      </w:r>
+      <w:r>
+        <w:rPr>
+          <w:rStyle w:val="VerbatimChar"/>
+        </w:rPr>
+        <w:t xml:space="preserve">git init</w:t>
+      </w:r>
+      <w:r>
+        <w:t xml:space="preserve">: cómo dejar de usar Git en una carpeta</w:t>
       </w:r>
     </w:p>
     <w:p>
@@ -4948,7 +5745,15 @@
         <w:pStyle w:val="FirstParagraph"/>
       </w:pPr>
       <w:r>
-        <w:t xml:space="preserve">Hasta aquí, todo lo que vimos pasa</w:t>
+        <w:t xml:space="preserve">Con el tiempo puede que termines un proyecto y quieras que Git deje de monitorear esa carpeta — que vuelva a ser una carpeta normal en tu computadora, sin historial de versiones.</w:t>
+      </w:r>
+    </w:p>
+    <w:p>
+      <w:pPr>
+        <w:pStyle w:val="BodyText"/>
+      </w:pPr>
+      <w:r>
+        <w:t xml:space="preserve">Todo lo que Git necesita para llevar el control de tu proyecto vive en</w:t>
       </w:r>
       <w:r>
         <w:t xml:space="preserve"> </w:t>
@@ -4958,13 +5763,497 @@
           <w:b/>
           <w:bCs/>
         </w:rPr>
+        <w:t xml:space="preserve">una sola carpeta oculta llamada</w:t>
+      </w:r>
+      <w:r>
+        <w:rPr>
+          <w:b/>
+          <w:bCs/>
+        </w:rPr>
+        <w:t xml:space="preserve"> </w:t>
+      </w:r>
+      <w:r>
+        <w:rPr>
+          <w:rStyle w:val="VerbatimChar"/>
+          <w:b/>
+          <w:bCs/>
+        </w:rPr>
+        <w:t xml:space="preserve">.git</w:t>
+      </w:r>
+      <w:r>
+        <w:t xml:space="preserve">, en la raíz del repositorio. Borrar esa carpeta es todo lo que hace falta.</w:t>
+      </w:r>
+    </w:p>
+    <w:bookmarkStart w:id="44" w:name="el-procedimiento"/>
+    <w:p>
+      <w:pPr>
+        <w:pStyle w:val="Heading3"/>
+      </w:pPr>
+      <w:r>
+        <w:t xml:space="preserve">9.1 El procedimiento</w:t>
+      </w:r>
+    </w:p>
+    <w:p>
+      <w:pPr>
+        <w:pStyle w:val="FirstParagraph"/>
+      </w:pPr>
+      <w:r>
+        <w:rPr>
+          <w:b/>
+          <w:bCs/>
+        </w:rPr>
+        <w:t xml:space="preserve">1. Confirma dónde está la carpeta oculta:</w:t>
+      </w:r>
+    </w:p>
+    <w:p>
+      <w:pPr>
+        <w:pStyle w:val="SourceCode"/>
+      </w:pPr>
+      <w:r>
+        <w:rPr>
+          <w:rStyle w:val="FunctionTok"/>
+        </w:rPr>
+        <w:t xml:space="preserve">ls</w:t>
+      </w:r>
+      <w:r>
+        <w:rPr>
+          <w:rStyle w:val="NormalTok"/>
+        </w:rPr>
+        <w:t xml:space="preserve"> </w:t>
+      </w:r>
+      <w:r>
+        <w:rPr>
+          <w:rStyle w:val="AttributeTok"/>
+        </w:rPr>
+        <w:t xml:space="preserve">-a</w:t>
+      </w:r>
+    </w:p>
+    <w:p>
+      <w:pPr>
+        <w:pStyle w:val="FirstParagraph"/>
+      </w:pPr>
+      <w:r>
+        <w:t xml:space="preserve">(En Windows con PowerShell:</w:t>
+      </w:r>
+      <w:r>
+        <w:t xml:space="preserve"> </w:t>
+      </w:r>
+      <w:r>
+        <w:rPr>
+          <w:rStyle w:val="VerbatimChar"/>
+        </w:rPr>
+        <w:t xml:space="preserve">Get-ChildItem -Force</w:t>
+      </w:r>
+      <w:r>
+        <w:t xml:space="preserve">. En el Explorador de archivos: activa</w:t>
+      </w:r>
+      <w:r>
+        <w:t xml:space="preserve"> </w:t>
+      </w:r>
+      <w:r>
+        <w:t xml:space="preserve">“Elementos ocultos”</w:t>
+      </w:r>
+      <w:r>
+        <w:t xml:space="preserve"> </w:t>
+      </w:r>
+      <w:r>
+        <w:t xml:space="preserve">en la pestaña Vista.)</w:t>
+      </w:r>
+    </w:p>
+    <w:p>
+      <w:pPr>
+        <w:pStyle w:val="BodyText"/>
+      </w:pPr>
+      <w:r>
+        <w:rPr>
+          <w:b/>
+          <w:bCs/>
+        </w:rPr>
+        <w:t xml:space="preserve">2. Bórrala:</w:t>
+      </w:r>
+    </w:p>
+    <w:tbl>
+      <w:tblPr>
+        <w:tblStyle w:val="Table"/>
+        <w:tblW w:type="auto" w:w="0"/>
+        <w:tblLook w:firstRow="1" w:lastRow="0" w:firstColumn="0" w:lastColumn="0" w:noHBand="0" w:noVBand="0" w:val="0020"/>
+      </w:tblPr>
+      <w:tblGrid>
+        <w:gridCol w:w="3960"/>
+        <w:gridCol w:w="3960"/>
+      </w:tblGrid>
+      <w:tr>
+        <w:trPr>
+          <w:tblHeader w:val="on"/>
+        </w:trPr>
+        <w:tc>
+          <w:tcPr/>
+          <w:p>
+            <w:pPr>
+              <w:pStyle w:val="Compact"/>
+            </w:pPr>
+            <w:r>
+              <w:t xml:space="preserve">Sistema</w:t>
+            </w:r>
+          </w:p>
+        </w:tc>
+        <w:tc>
+          <w:tcPr/>
+          <w:p>
+            <w:pPr>
+              <w:pStyle w:val="Compact"/>
+            </w:pPr>
+            <w:r>
+              <w:t xml:space="preserve">Comando</w:t>
+            </w:r>
+          </w:p>
+        </w:tc>
+      </w:tr>
+      <w:tr>
+        <w:tc>
+          <w:tcPr/>
+          <w:p>
+            <w:pPr>
+              <w:pStyle w:val="Compact"/>
+            </w:pPr>
+            <w:r>
+              <w:t xml:space="preserve">macOS / Linux (terminal)</w:t>
+            </w:r>
+          </w:p>
+        </w:tc>
+        <w:tc>
+          <w:tcPr/>
+          <w:p>
+            <w:pPr>
+              <w:pStyle w:val="Compact"/>
+            </w:pPr>
+            <w:r>
+              <w:rPr>
+                <w:rStyle w:val="VerbatimChar"/>
+              </w:rPr>
+              <w:t xml:space="preserve">rm -rf .git</w:t>
+            </w:r>
+          </w:p>
+        </w:tc>
+      </w:tr>
+      <w:tr>
+        <w:tc>
+          <w:tcPr/>
+          <w:p>
+            <w:pPr>
+              <w:pStyle w:val="Compact"/>
+            </w:pPr>
+            <w:r>
+              <w:t xml:space="preserve">Windows (PowerShell)</w:t>
+            </w:r>
+          </w:p>
+        </w:tc>
+        <w:tc>
+          <w:tcPr/>
+          <w:p>
+            <w:pPr>
+              <w:pStyle w:val="Compact"/>
+            </w:pPr>
+            <w:r>
+              <w:rPr>
+                <w:rStyle w:val="VerbatimChar"/>
+              </w:rPr>
+              <w:t xml:space="preserve">Remove-Item -Recurse -Force .git</w:t>
+            </w:r>
+          </w:p>
+        </w:tc>
+      </w:tr>
+      <w:tr>
+        <w:tc>
+          <w:tcPr/>
+          <w:p>
+            <w:pPr>
+              <w:pStyle w:val="Compact"/>
+            </w:pPr>
+            <w:r>
+              <w:t xml:space="preserve">Windows (símbolo del sistema)</w:t>
+            </w:r>
+          </w:p>
+        </w:tc>
+        <w:tc>
+          <w:tcPr/>
+          <w:p>
+            <w:pPr>
+              <w:pStyle w:val="Compact"/>
+            </w:pPr>
+            <w:r>
+              <w:rPr>
+                <w:rStyle w:val="VerbatimChar"/>
+              </w:rPr>
+              <w:t xml:space="preserve">rmdir /s /q .git</w:t>
+            </w:r>
+          </w:p>
+        </w:tc>
+      </w:tr>
+    </w:tbl>
+    <w:p>
+      <w:pPr>
+        <w:pStyle w:val="BodyText"/>
+      </w:pPr>
+      <w:r>
+        <w:rPr>
+          <w:b/>
+          <w:bCs/>
+        </w:rPr>
+        <w:t xml:space="preserve">3. Confirma que ya no es un repositorio:</w:t>
+      </w:r>
+    </w:p>
+    <w:p>
+      <w:pPr>
+        <w:pStyle w:val="SourceCode"/>
+      </w:pPr>
+      <w:r>
+        <w:rPr>
+          <w:rStyle w:val="FunctionTok"/>
+        </w:rPr>
+        <w:t xml:space="preserve">git</w:t>
+      </w:r>
+      <w:r>
+        <w:rPr>
+          <w:rStyle w:val="NormalTok"/>
+        </w:rPr>
+        <w:t xml:space="preserve"> status</w:t>
+      </w:r>
+    </w:p>
+    <w:p>
+      <w:pPr>
+        <w:pStyle w:val="FirstParagraph"/>
+      </w:pPr>
+      <w:r>
+        <w:t xml:space="preserve">Debería responder</w:t>
+      </w:r>
+      <w:r>
+        <w:t xml:space="preserve"> </w:t>
+      </w:r>
+      <w:r>
+        <w:rPr>
+          <w:rStyle w:val="VerbatimChar"/>
+        </w:rPr>
+        <w:t xml:space="preserve">fatal: not a git repository (or any of the parent directories): .git</w:t>
+      </w:r>
+      <w:r>
+        <w:t xml:space="preserve"> </w:t>
+      </w:r>
+      <w:r>
+        <w:t xml:space="preserve">— eso confirma que la carpeta volvió a ser una carpeta normal.</w:t>
+      </w:r>
+    </w:p>
+    <w:bookmarkEnd w:id="44"/>
+    <w:bookmarkStart w:id="45" w:name="dos-advertencias-importantes"/>
+    <w:p>
+      <w:pPr>
+        <w:pStyle w:val="Heading3"/>
+      </w:pPr>
+      <w:r>
+        <w:t xml:space="preserve">9.2 Dos advertencias importantes</w:t>
+      </w:r>
+    </w:p>
+    <w:p>
+      <w:pPr>
+        <w:pStyle w:val="Compact"/>
+        <w:numPr>
+          <w:ilvl w:val="0"/>
+          <w:numId w:val="1006"/>
+        </w:numPr>
+      </w:pPr>
+      <w:r>
+        <w:rPr>
+          <w:b/>
+          <w:bCs/>
+        </w:rPr>
+        <w:t xml:space="preserve">Es irreversible.</w:t>
+      </w:r>
+      <w:r>
+        <w:t xml:space="preserve"> </w:t>
+      </w:r>
+      <w:r>
+        <w:t xml:space="preserve">Al borrar</w:t>
+      </w:r>
+      <w:r>
+        <w:t xml:space="preserve"> </w:t>
+      </w:r>
+      <w:r>
+        <w:rPr>
+          <w:rStyle w:val="VerbatimChar"/>
+        </w:rPr>
+        <w:t xml:space="preserve">.git</w:t>
+      </w:r>
+      <w:r>
+        <w:t xml:space="preserve"> </w:t>
+      </w:r>
+      <w:r>
+        <w:t xml:space="preserve">desaparece todo el historial de commits, ramas y etiquetas que solo existían en tu computadora. Tus archivos de código quedan intactos — lo único que se pierde es el registro de cambios. Si crees que podrías necesitar ese historial después, copia la carpeta</w:t>
+      </w:r>
+      <w:r>
+        <w:t xml:space="preserve"> </w:t>
+      </w:r>
+      <w:r>
+        <w:rPr>
+          <w:rStyle w:val="VerbatimChar"/>
+        </w:rPr>
+        <w:t xml:space="preserve">.git</w:t>
+      </w:r>
+      <w:r>
+        <w:t xml:space="preserve"> </w:t>
+      </w:r>
+      <w:r>
+        <w:t xml:space="preserve">antes de borrarla, en vez de perderla para siempre.</w:t>
+      </w:r>
+    </w:p>
+    <w:p>
+      <w:pPr>
+        <w:pStyle w:val="Compact"/>
+        <w:numPr>
+          <w:ilvl w:val="0"/>
+          <w:numId w:val="1006"/>
+        </w:numPr>
+      </w:pPr>
+      <w:r>
+        <w:rPr>
+          <w:b/>
+          <w:bCs/>
+        </w:rPr>
+        <w:t xml:space="preserve">No afecta a GitHub.</w:t>
+      </w:r>
+      <w:r>
+        <w:t xml:space="preserve"> </w:t>
+      </w:r>
+      <w:r>
+        <w:t xml:space="preserve">Si ya habías hecho</w:t>
+      </w:r>
+      <w:r>
+        <w:t xml:space="preserve"> </w:t>
+      </w:r>
+      <w:r>
+        <w:rPr>
+          <w:rStyle w:val="VerbatimChar"/>
+        </w:rPr>
+        <w:t xml:space="preserve">push</w:t>
+      </w:r>
+      <w:r>
+        <w:t xml:space="preserve"> </w:t>
+      </w:r>
+      <w:r>
+        <w:t xml:space="preserve">de ese proyecto, borrar</w:t>
+      </w:r>
+      <w:r>
+        <w:t xml:space="preserve"> </w:t>
+      </w:r>
+      <w:r>
+        <w:rPr>
+          <w:rStyle w:val="VerbatimChar"/>
+        </w:rPr>
+        <w:t xml:space="preserve">.git</w:t>
+      </w:r>
+      <w:r>
+        <w:t xml:space="preserve"> </w:t>
+      </w:r>
+      <w:r>
+        <w:t xml:space="preserve">localmente no borra nada en GitHub — el repositorio remoto sigue existiendo tal cual. Para eliminarlo también de ahí es una acción aparte, igualmente irreversible:</w:t>
+      </w:r>
+      <w:r>
+        <w:t xml:space="preserve"> </w:t>
+      </w:r>
+      <w:r>
+        <w:rPr>
+          <w:rStyle w:val="VerbatimChar"/>
+        </w:rPr>
+        <w:t xml:space="preserve">Settings → General → Danger Zone → Delete this repository</w:t>
+      </w:r>
+      <w:r>
+        <w:t xml:space="preserve">.</w:t>
+      </w:r>
+    </w:p>
+    <w:p>
+      <w:pPr>
+        <w:pStyle w:val="BlockText"/>
+      </w:pPr>
+      <w:r>
+        <w:rPr>
+          <w:b/>
+          <w:bCs/>
+        </w:rPr>
+        <w:t xml:space="preserve">Nota:</w:t>
+      </w:r>
+      <w:r>
+        <w:t xml:space="preserve"> </w:t>
+      </w:r>
+      <w:r>
+        <w:t xml:space="preserve">si en realidad solo quieres desconectar la carpeta de un repositorio de GitHub pero conservando tu historial local, eso es distinto:</w:t>
+      </w:r>
+      <w:r>
+        <w:t xml:space="preserve"> </w:t>
+      </w:r>
+      <w:r>
+        <w:rPr>
+          <w:rStyle w:val="VerbatimChar"/>
+        </w:rPr>
+        <w:t xml:space="preserve">git remote remove origin</w:t>
+      </w:r>
+      <w:r>
+        <w:t xml:space="preserve">. Borrar</w:t>
+      </w:r>
+      <w:r>
+        <w:t xml:space="preserve"> </w:t>
+      </w:r>
+      <w:r>
+        <w:rPr>
+          <w:rStyle w:val="VerbatimChar"/>
+        </w:rPr>
+        <w:t xml:space="preserve">.git</w:t>
+      </w:r>
+      <w:r>
+        <w:t xml:space="preserve"> </w:t>
+      </w:r>
+      <w:r>
+        <w:t xml:space="preserve">es para cuando quieres que la carpeta deje de tener cualquier rastro de Git.</w:t>
+      </w:r>
+    </w:p>
+    <w:p>
+      <w:r>
+        <w:pict>
+          <v:rect style="width:0;height:1.5pt" o:hralign="center" o:hrstd="t" o:hr="t"/>
+        </w:pict>
+      </w:r>
+    </w:p>
+    <w:bookmarkEnd w:id="45"/>
+    <w:bookmarkEnd w:id="46"/>
+    <w:bookmarkStart w:id="50" w:name="dónde-entra-github"/>
+    <w:p>
+      <w:pPr>
+        <w:pStyle w:val="Heading2"/>
+      </w:pPr>
+      <w:r>
+        <w:t xml:space="preserve">10. ¿Dónde entra GitHub?</w:t>
+      </w:r>
+    </w:p>
+    <w:p>
+      <w:pPr>
+        <w:pStyle w:val="FirstParagraph"/>
+      </w:pPr>
+      <w:r>
+        <w:t xml:space="preserve">Hasta aquí, todo lo que vimos pasa</w:t>
+      </w:r>
+      <w:r>
+        <w:t xml:space="preserve"> </w:t>
+      </w:r>
+      <w:r>
+        <w:rPr>
+          <w:b/>
+          <w:bCs/>
+        </w:rPr>
         <w:t xml:space="preserve">solo en tu computadora</w:t>
       </w:r>
       <w:r>
         <w:t xml:space="preserve">. Nadie más puede ver tu historial de commits, y si tu disco duro muere, lo pierdes todo. Ahí es donde entra GitHub: es el lugar donde subes tu repositorio para tener una copia en la nube y compartirla.</w:t>
       </w:r>
     </w:p>
-    <w:bookmarkStart w:id="43" w:name="el-flujo-completo-con-github"/>
+    <w:bookmarkStart w:id="47" w:name="el-flujo-completo-con-github"/>
     <w:p>
       <w:pPr>
         <w:pStyle w:val="Heading3"/>
@@ -5014,8 +6303,8 @@
         <w:t xml:space="preserve">  (repites esto varias veces)   ◄──pull──   (o traes cambios de otros)</w:t>
       </w:r>
     </w:p>
-    <w:bookmarkEnd w:id="43"/>
-    <w:bookmarkStart w:id="44" w:name="los-comandos-nuevos-que-se-agregan"/>
+    <w:bookmarkEnd w:id="47"/>
+    <w:bookmarkStart w:id="48" w:name="los-comandos-nuevos-que-se-agregan"/>
     <w:p>
       <w:pPr>
         <w:pStyle w:val="Heading3"/>
@@ -5171,8 +6460,8 @@
         </w:tc>
       </w:tr>
     </w:tbl>
-    <w:bookmarkEnd w:id="44"/>
-    <w:bookmarkStart w:id="45" w:name="X6abff501827f6ba1955a7f692a47387762485ea"/>
+    <w:bookmarkEnd w:id="48"/>
+    <w:bookmarkStart w:id="49" w:name="X6abff501827f6ba1955a7f692a47387762485ea"/>
     <w:p>
       <w:pPr>
         <w:pStyle w:val="Heading3"/>
@@ -5344,15 +6633,15 @@
         </w:pict>
       </w:r>
     </w:p>
-    <w:bookmarkEnd w:id="45"/>
-    <w:bookmarkEnd w:id="46"/>
-    <w:bookmarkStart w:id="52" w:name="conceptos-exclusivos-de-github-no-de-git"/>
+    <w:bookmarkEnd w:id="49"/>
+    <w:bookmarkEnd w:id="50"/>
+    <w:bookmarkStart w:id="56" w:name="conceptos-exclusivos-de-github-no-de-git"/>
     <w:p>
       <w:pPr>
         <w:pStyle w:val="Heading2"/>
       </w:pPr>
       <w:r>
-        <w:t xml:space="preserve">10. Conceptos exclusivos de GitHub (no de Git)</w:t>
+        <w:t xml:space="preserve">11. Conceptos exclusivos de GitHub (no de Git)</w:t>
       </w:r>
     </w:p>
     <w:p>
@@ -5363,7 +6652,7 @@
         <w:t xml:space="preserve">Estos son conceptos que existen porque GitHub es una plataforma social/colaborativa, no porque Git los necesite:</w:t>
       </w:r>
     </w:p>
-    <w:bookmarkStart w:id="47" w:name="fork"/>
+    <w:bookmarkStart w:id="51" w:name="fork"/>
     <w:p>
       <w:pPr>
         <w:pStyle w:val="Heading3"/>
@@ -5380,8 +6669,8 @@
         <w:t xml:space="preserve">Una copia completa de un repositorio ajeno, dentro de tu propia cuenta de GitHub. Se usa cuando quieres proponer cambios a un proyecto en el que no tienes permiso directo de escritura (por ejemplo, un proyecto de código abierto). Haces un fork, cambias lo que quieras en tu copia, y luego propones que esos cambios se incorporen al original.</w:t>
       </w:r>
     </w:p>
-    <w:bookmarkEnd w:id="47"/>
-    <w:bookmarkStart w:id="48" w:name="pull-request-pr"/>
+    <w:bookmarkEnd w:id="51"/>
+    <w:bookmarkStart w:id="52" w:name="pull-request-pr"/>
     <w:p>
       <w:pPr>
         <w:pStyle w:val="Heading3"/>
@@ -5442,8 +6731,8 @@
         <w:t xml:space="preserve">de tus cambios.</w:t>
       </w:r>
     </w:p>
-    <w:bookmarkEnd w:id="48"/>
-    <w:bookmarkStart w:id="49" w:name="issues"/>
+    <w:bookmarkEnd w:id="52"/>
+    <w:bookmarkStart w:id="53" w:name="issues"/>
     <w:p>
       <w:pPr>
         <w:pStyle w:val="Heading3"/>
@@ -5482,8 +6771,8 @@
         <w:t xml:space="preserve">), proponer nuevas funciones, o discutir ideas — todo organizado como tickets, cada uno con su propia conversación.</w:t>
       </w:r>
     </w:p>
-    <w:bookmarkEnd w:id="49"/>
-    <w:bookmarkStart w:id="50" w:name="readme.md"/>
+    <w:bookmarkEnd w:id="53"/>
+    <w:bookmarkStart w:id="54" w:name="readme.md"/>
     <w:p>
       <w:pPr>
         <w:pStyle w:val="Heading3"/>
@@ -5512,8 +6801,8 @@
         <w:t xml:space="preserve">del proyecto: qué hace, cómo instalarlo, cómo usarlo.</w:t>
       </w:r>
     </w:p>
-    <w:bookmarkEnd w:id="50"/>
-    <w:bookmarkStart w:id="51" w:name="repositorio-público-vs.-privado"/>
+    <w:bookmarkEnd w:id="54"/>
+    <w:bookmarkStart w:id="55" w:name="repositorio-público-vs.-privado"/>
     <w:p>
       <w:pPr>
         <w:pStyle w:val="Heading3"/>
@@ -5537,15 +6826,15 @@
         </w:pict>
       </w:r>
     </w:p>
-    <w:bookmarkEnd w:id="51"/>
-    <w:bookmarkEnd w:id="52"/>
-    <w:bookmarkStart w:id="53" w:name="Xf63c6f22962f8a3087eb1832713afa68dccc29a"/>
+    <w:bookmarkEnd w:id="55"/>
+    <w:bookmarkEnd w:id="56"/>
+    <w:bookmarkStart w:id="57" w:name="Xf63c6f22962f8a3087eb1832713afa68dccc29a"/>
     <w:p>
       <w:pPr>
         <w:pStyle w:val="Heading2"/>
       </w:pPr>
       <w:r>
-        <w:t xml:space="preserve">11. Un día típico trabajando con Git y GitHub</w:t>
+        <w:t xml:space="preserve">12. Un día típico trabajando con Git y GitHub</w:t>
       </w:r>
     </w:p>
     <w:p>
@@ -5560,7 +6849,7 @@
       <w:pPr>
         <w:numPr>
           <w:ilvl w:val="0"/>
-          <w:numId w:val="1006"/>
+          <w:numId w:val="1007"/>
         </w:numPr>
       </w:pPr>
       <w:r>
@@ -5599,7 +6888,7 @@
       <w:pPr>
         <w:numPr>
           <w:ilvl w:val="0"/>
-          <w:numId w:val="1006"/>
+          <w:numId w:val="1007"/>
         </w:numPr>
       </w:pPr>
       <w:r>
@@ -5620,7 +6909,7 @@
       <w:pPr>
         <w:numPr>
           <w:ilvl w:val="0"/>
-          <w:numId w:val="1006"/>
+          <w:numId w:val="1007"/>
         </w:numPr>
       </w:pPr>
       <w:r>
@@ -5695,7 +6984,7 @@
       <w:pPr>
         <w:numPr>
           <w:ilvl w:val="0"/>
-          <w:numId w:val="1006"/>
+          <w:numId w:val="1007"/>
         </w:numPr>
       </w:pPr>
       <w:r>
@@ -5737,7 +7026,7 @@
       <w:pPr>
         <w:numPr>
           <w:ilvl w:val="0"/>
-          <w:numId w:val="1006"/>
+          <w:numId w:val="1007"/>
         </w:numPr>
       </w:pPr>
       <w:r>
@@ -5767,14 +7056,14 @@
         </w:pict>
       </w:r>
     </w:p>
-    <w:bookmarkEnd w:id="53"/>
-    <w:bookmarkStart w:id="54" w:name="X516cae662d5c3c512497b7e76db170c64040285"/>
+    <w:bookmarkEnd w:id="57"/>
+    <w:bookmarkStart w:id="58" w:name="X516cae662d5c3c512497b7e76db170c64040285"/>
     <w:p>
       <w:pPr>
         <w:pStyle w:val="Heading2"/>
       </w:pPr>
       <w:r>
-        <w:t xml:space="preserve">12. Errores típicos de quien empieza (y cómo entenderlos)</w:t>
+        <w:t xml:space="preserve">13. Errores típicos de quien empieza (y cómo entenderlos)</w:t>
       </w:r>
     </w:p>
     <w:tbl>
@@ -6069,14 +7358,14 @@
         </w:pict>
       </w:r>
     </w:p>
-    <w:bookmarkEnd w:id="54"/>
-    <w:bookmarkStart w:id="55" w:name="glosario-rápido-para-tener-a-la-mano"/>
+    <w:bookmarkEnd w:id="58"/>
+    <w:bookmarkStart w:id="59" w:name="glosario-rápido-para-tener-a-la-mano"/>
     <w:p>
       <w:pPr>
         <w:pStyle w:val="Heading2"/>
       </w:pPr>
       <w:r>
-        <w:t xml:space="preserve">13. Glosario rápido para tener a la mano</w:t>
+        <w:t xml:space="preserve">14. Glosario rápido para tener a la mano</w:t>
       </w:r>
     </w:p>
     <w:tbl>
@@ -6473,14 +7762,14 @@
         </w:pict>
       </w:r>
     </w:p>
-    <w:bookmarkEnd w:id="55"/>
-    <w:bookmarkStart w:id="56" w:name="X8e17b39da93d592ac868fbbe08ee83da6c00509"/>
+    <w:bookmarkEnd w:id="59"/>
+    <w:bookmarkStart w:id="60" w:name="X8e17b39da93d592ac868fbbe08ee83da6c00509"/>
     <w:p>
       <w:pPr>
         <w:pStyle w:val="Heading2"/>
       </w:pPr>
       <w:r>
-        <w:t xml:space="preserve">14. Lo que hay que recordar si solo te queda una idea</w:t>
+        <w:t xml:space="preserve">15. Lo que hay que recordar si solo te queda una idea</w:t>
       </w:r>
     </w:p>
     <w:p>
@@ -6525,8 +7814,8 @@
         <w:t xml:space="preserve">Todo lo demás — commits, ramas, pull requests, forks — son piezas que existen para resolver un problema muy concreto: que el trabajo en equipo sobre el mismo código no sea un caos.</w:t>
       </w:r>
     </w:p>
-    <w:bookmarkEnd w:id="56"/>
-    <w:bookmarkEnd w:id="57"/>
+    <w:bookmarkEnd w:id="60"/>
+    <w:bookmarkEnd w:id="61"/>
     <w:sectPr>
       <w:footnotePr>
         <w:numRestart w:val="eachSect"/>
@@ -7010,6 +8299,9 @@
     </w:lvlOverride>
   </w:num>
   <w:num w:numId="1006">
+    <w:abstractNumId w:val="991"/>
+  </w:num>
+  <w:num w:numId="1007">
     <w:abstractNumId w:val="99411"/>
     <w:lvlOverride w:ilvl="0">
       <w:startOverride w:val="1"/>

</xml_diff>